<commit_message>
Add verify_docx.py (Word vs transcript check); fix headings and page markers
Headings now render redaction bars and checkboxes. Page markers read 'Scan page N'
so transcript lines like 'Page 3 of 6' are not mistaken for markers.
All 386 pages across 20 packets match their transcripts.

Co-Authored-By: Claude Opus 5.5 <noreply@anthropic.com>
Claude-Session: https://claude.ai/code/session_01AbzK3rwiBUWTvL8AHAmsJH
</commit_message>
<xml_diff>
--- a/demo/fictional/F01/F01.docx
+++ b/demo/fictional/F01/F01.docx
@@ -1243,7 +1243,7 @@
           <w:sz w:val="13"/>
           <w:szCs w:val="13"/>
         </w:rPr>
-        <w:t xml:space="preserve">Page 1</w:t>
+        <w:t xml:space="preserve">Scan page 1</w:t>
       </w:r>
     </w:p>
     <w:p>
@@ -2071,7 +2071,7 @@
           <w:sz w:val="13"/>
           <w:szCs w:val="13"/>
         </w:rPr>
-        <w:t xml:space="preserve">Page 2</w:t>
+        <w:t xml:space="preserve">Scan page 2</w:t>
       </w:r>
     </w:p>
     <w:p>
@@ -6671,7 +6671,7 @@
           <w:sz w:val="13"/>
           <w:szCs w:val="13"/>
         </w:rPr>
-        <w:t xml:space="preserve">Page 3</w:t>
+        <w:t xml:space="preserve">Scan page 3</w:t>
       </w:r>
     </w:p>
     <w:p>
@@ -7993,7 +7993,7 @@
           <w:sz w:val="13"/>
           <w:szCs w:val="13"/>
         </w:rPr>
-        <w:t xml:space="preserve">Page 4</w:t>
+        <w:t xml:space="preserve">Scan page 4</w:t>
       </w:r>
     </w:p>
     <w:p>
@@ -9451,7 +9451,7 @@
           <w:sz w:val="13"/>
           <w:szCs w:val="13"/>
         </w:rPr>
-        <w:t xml:space="preserve">Page 5</w:t>
+        <w:t xml:space="preserve">Scan page 5</w:t>
       </w:r>
     </w:p>
     <w:p>
@@ -9920,7 +9920,7 @@
           <w:sz w:val="13"/>
           <w:szCs w:val="13"/>
         </w:rPr>
-        <w:t xml:space="preserve">Page 6</w:t>
+        <w:t xml:space="preserve">Scan page 6</w:t>
       </w:r>
     </w:p>
     <w:p>
@@ -10856,7 +10856,7 @@
           <w:sz w:val="13"/>
           <w:szCs w:val="13"/>
         </w:rPr>
-        <w:t xml:space="preserve">Page 7</w:t>
+        <w:t xml:space="preserve">Scan page 7</w:t>
       </w:r>
     </w:p>
     <w:p>
@@ -11706,7 +11706,7 @@
           <w:sz w:val="13"/>
           <w:szCs w:val="13"/>
         </w:rPr>
-        <w:t xml:space="preserve">Page 8</w:t>
+        <w:t xml:space="preserve">Scan page 8</w:t>
       </w:r>
     </w:p>
     <w:p>
@@ -12630,7 +12630,7 @@
           <w:sz w:val="13"/>
           <w:szCs w:val="13"/>
         </w:rPr>
-        <w:t xml:space="preserve">Page 9</w:t>
+        <w:t xml:space="preserve">Scan page 9</w:t>
       </w:r>
     </w:p>
     <w:p>
@@ -12875,7 +12875,7 @@
           <w:sz w:val="13"/>
           <w:szCs w:val="13"/>
         </w:rPr>
-        <w:t xml:space="preserve">Page 10</w:t>
+        <w:t xml:space="preserve">Scan page 10</w:t>
       </w:r>
     </w:p>
     <w:p>
@@ -13238,7 +13238,7 @@
           <w:sz w:val="13"/>
           <w:szCs w:val="13"/>
         </w:rPr>
-        <w:t xml:space="preserve">Page 11</w:t>
+        <w:t xml:space="preserve">Scan page 11</w:t>
       </w:r>
     </w:p>
     <w:p>

</xml_diff>